<commit_message>
Conclusão da semana 5, Relizado os questionários, exercícios e desafios.
</commit_message>
<xml_diff>
--- a/plano-de-estudo/BACK-END_JAVASCRIPT_QUESTIONARIO-FASE1_SEMANA4.docx
+++ b/plano-de-estudo/BACK-END_JAVASCRIPT_QUESTIONARIO-FASE1_SEMANA4.docx
@@ -596,7 +596,26 @@
           <w:sz w:val="20"/>
           <w:szCs w:val="20"/>
         </w:rPr>
-        <w:t xml:space="preserve">Compreender o conceito de função e sua importância. </w:t>
+        <w:t xml:space="preserve">Compreender o conceito de função e </w:t>
+      </w:r>
+      <w:r>
+        <w:rPr>
+          <w:rFonts w:ascii="Segoe UI Black" w:hAnsi="Segoe UI Black"/>
+          <w:color w:val="666666"/>
+          <w:sz w:val="20"/>
+          <w:szCs w:val="20"/>
+          <w:shd w:fill="FFFFFF" w:val="clear"/>
+        </w:rPr>
+        <w:t>sua</w:t>
+      </w:r>
+      <w:r>
+        <w:rPr>
+          <w:rFonts w:ascii="Segoe UI Black" w:hAnsi="Segoe UI Black"/>
+          <w:color w:val="666666"/>
+          <w:sz w:val="20"/>
+          <w:szCs w:val="20"/>
+        </w:rPr>
+        <w:t xml:space="preserve"> importância. </w:t>
       </w:r>
     </w:p>
     <w:p>
@@ -1021,7 +1040,7 @@
       </w:r>
       <w:r>
         <w:rPr>
-          <w:rStyle w:val="Cdigo-fonteuser"/>
+          <w:rStyle w:val="Cdigo-fonte"/>
           <w:rFonts w:ascii="Segoe UI Black" w:hAnsi="Segoe UI Black"/>
           <w:color w:val="666666"/>
           <w:sz w:val="18"/>
@@ -1102,7 +1121,7 @@
       </w:r>
       <w:r>
         <w:rPr>
-          <w:rStyle w:val="Cdigo-fonteuser"/>
+          <w:rStyle w:val="Cdigo-fonte"/>
           <w:rFonts w:ascii="Segoe UI Black" w:hAnsi="Segoe UI Black"/>
           <w:color w:val="666666"/>
           <w:sz w:val="18"/>
@@ -5075,7 +5094,7 @@
     </w:p>
     <w:p>
       <w:pPr>
-        <w:pStyle w:val="Textoprformatadouser"/>
+        <w:pStyle w:val="Textoprformatado"/>
         <w:spacing w:before="0" w:after="0"/>
         <w:ind w:hanging="0" w:start="0" w:end="0"/>
         <w:rPr>
@@ -5089,7 +5108,7 @@
       <w:bookmarkEnd w:id="0"/>
       <w:r>
         <w:rPr>
-          <w:rStyle w:val="Cdigo-fonteuser"/>
+          <w:rStyle w:val="Cdigo-fonte"/>
           <w:rFonts w:ascii="Segoe UI Black" w:hAnsi="Segoe UI Black"/>
           <w:color w:val="666666"/>
           <w:sz w:val="18"/>
@@ -5404,7 +5423,7 @@
     </w:p>
     <w:p>
       <w:pPr>
-        <w:pStyle w:val="Textoprformatadouser"/>
+        <w:pStyle w:val="Textoprformatado"/>
         <w:spacing w:before="0" w:after="0"/>
         <w:ind w:hanging="0" w:start="0" w:end="0"/>
         <w:rPr>
@@ -5587,7 +5606,7 @@
     </w:p>
     <w:p>
       <w:pPr>
-        <w:pStyle w:val="Textoprformatadouser"/>
+        <w:pStyle w:val="Textoprformatado"/>
         <w:numPr>
           <w:ilvl w:val="0"/>
           <w:numId w:val="3"/>
@@ -5603,7 +5622,7 @@
       <w:bookmarkEnd w:id="1"/>
       <w:r>
         <w:rPr>
-          <w:rStyle w:val="Cdigo-fonteuser"/>
+          <w:rStyle w:val="Cdigo-fonte"/>
           <w:rFonts w:ascii="Segoe UI Semibold" w:hAnsi="Segoe UI Semibold"/>
           <w:color w:val="333333"/>
           <w:sz w:val="18"/>
@@ -5614,7 +5633,7 @@
     </w:p>
     <w:p>
       <w:pPr>
-        <w:pStyle w:val="Textoprformatadouser"/>
+        <w:pStyle w:val="Textoprformatado"/>
         <w:numPr>
           <w:ilvl w:val="0"/>
           <w:numId w:val="3"/>
@@ -5628,7 +5647,7 @@
       </w:pPr>
       <w:r>
         <w:rPr>
-          <w:rStyle w:val="Cdigo-fonteuser"/>
+          <w:rStyle w:val="Cdigo-fonte"/>
           <w:rFonts w:ascii="Segoe UI Semibold" w:hAnsi="Segoe UI Semibold"/>
           <w:color w:val="333333"/>
           <w:sz w:val="18"/>
@@ -5639,7 +5658,7 @@
     </w:p>
     <w:p>
       <w:pPr>
-        <w:pStyle w:val="Textoprformatadouser"/>
+        <w:pStyle w:val="Textoprformatado"/>
         <w:numPr>
           <w:ilvl w:val="0"/>
           <w:numId w:val="3"/>
@@ -5653,7 +5672,7 @@
       </w:pPr>
       <w:r>
         <w:rPr>
-          <w:rStyle w:val="Cdigo-fonteuser"/>
+          <w:rStyle w:val="Cdigo-fonte"/>
           <w:rFonts w:ascii="Segoe UI Semibold" w:hAnsi="Segoe UI Semibold"/>
           <w:color w:val="333333"/>
           <w:sz w:val="18"/>
@@ -5664,7 +5683,7 @@
     </w:p>
     <w:p>
       <w:pPr>
-        <w:pStyle w:val="Textoprformatadouser"/>
+        <w:pStyle w:val="Textoprformatado"/>
         <w:numPr>
           <w:ilvl w:val="0"/>
           <w:numId w:val="3"/>
@@ -5678,7 +5697,7 @@
       </w:pPr>
       <w:r>
         <w:rPr>
-          <w:rStyle w:val="Cdigo-fonteuser"/>
+          <w:rStyle w:val="Cdigo-fonte"/>
           <w:rFonts w:ascii="Segoe UI Semibold" w:hAnsi="Segoe UI Semibold"/>
           <w:color w:val="333333"/>
           <w:sz w:val="18"/>
@@ -5689,7 +5708,7 @@
     </w:p>
     <w:p>
       <w:pPr>
-        <w:pStyle w:val="Textoprformatadouser"/>
+        <w:pStyle w:val="Textoprformatado"/>
         <w:numPr>
           <w:ilvl w:val="0"/>
           <w:numId w:val="3"/>
@@ -5703,7 +5722,7 @@
       </w:pPr>
       <w:r>
         <w:rPr>
-          <w:rStyle w:val="Cdigo-fonteuser"/>
+          <w:rStyle w:val="Cdigo-fonte"/>
           <w:rFonts w:ascii="Segoe UI Semibold" w:hAnsi="Segoe UI Semibold"/>
           <w:color w:val="333333"/>
           <w:sz w:val="18"/>
@@ -5714,7 +5733,7 @@
     </w:p>
     <w:p>
       <w:pPr>
-        <w:pStyle w:val="Textoprformatadouser"/>
+        <w:pStyle w:val="Textoprformatado"/>
         <w:numPr>
           <w:ilvl w:val="0"/>
           <w:numId w:val="3"/>
@@ -5728,7 +5747,7 @@
       </w:pPr>
       <w:r>
         <w:rPr>
-          <w:rStyle w:val="Cdigo-fonteuser"/>
+          <w:rStyle w:val="Cdigo-fonte"/>
           <w:rFonts w:ascii="Segoe UI Semibold" w:hAnsi="Segoe UI Semibold"/>
           <w:color w:val="333333"/>
           <w:sz w:val="18"/>
@@ -5739,7 +5758,7 @@
     </w:p>
     <w:p>
       <w:pPr>
-        <w:pStyle w:val="Textoprformatadouser"/>
+        <w:pStyle w:val="Textoprformatado"/>
         <w:numPr>
           <w:ilvl w:val="0"/>
           <w:numId w:val="3"/>
@@ -5754,7 +5773,7 @@
       </w:pPr>
       <w:r>
         <w:rPr>
-          <w:rStyle w:val="Cdigo-fonteuser"/>
+          <w:rStyle w:val="Cdigo-fonte"/>
           <w:rFonts w:ascii="Segoe UI Semibold" w:hAnsi="Segoe UI Semibold"/>
           <w:color w:val="333333"/>
           <w:sz w:val="18"/>
@@ -5765,10 +5784,10 @@
     </w:p>
     <w:p>
       <w:pPr>
-        <w:pStyle w:val="Textoprformatadouser"/>
-        <w:spacing w:before="0" w:after="0"/>
-        <w:rPr>
-          <w:rStyle w:val="Cdigo-fonteuser"/>
+        <w:pStyle w:val="Textoprformatado"/>
+        <w:spacing w:before="0" w:after="0"/>
+        <w:rPr>
+          <w:rStyle w:val="Cdigo-fonte"/>
           <w:rFonts w:ascii="Segoe UI Semibold" w:hAnsi="Segoe UI Semibold"/>
           <w:sz w:val="18"/>
         </w:rPr>
@@ -5863,9 +5882,6 @@
       <w:r>
         <w:rPr>
           <w:rFonts w:ascii="Miriam Mono CLM" w:hAnsi="Miriam Mono CLM"/>
-          <w:color w:val="333333"/>
-          <w:sz w:val="18"/>
-          <w:szCs w:val="18"/>
         </w:rPr>
       </w:r>
     </w:p>
@@ -8865,16 +8881,7 @@
           <w:sz w:val="18"/>
           <w:szCs w:val="18"/>
         </w:rPr>
-        <w:t xml:space="preserve">Responda: </w:t>
-      </w:r>
-      <w:r>
-        <w:rPr>
-          <w:rFonts w:ascii="Segoe UI Semibold" w:hAnsi="Segoe UI Semibold"/>
-          <w:color w:val="333333"/>
-          <w:sz w:val="18"/>
-          <w:szCs w:val="18"/>
-        </w:rPr>
-        <w:t>É uma função que retornará o mesmo valor sempre que receber os mesmos argumentos, sem efeito colateral fora de seu escopo</w:t>
+        <w:t>Responda: É uma função que retornará o mesmo valor sempre que receber os mesmos argumentos, sem efeito colateral fora de seu escopo</w:t>
       </w:r>
     </w:p>
     <w:p>
@@ -8929,34 +8936,7 @@
           <w:sz w:val="18"/>
           <w:szCs w:val="18"/>
         </w:rPr>
-        <w:t xml:space="preserve">Responda: </w:t>
-      </w:r>
-      <w:r>
-        <w:rPr>
-          <w:rFonts w:ascii="Segoe UI Semibold" w:hAnsi="Segoe UI Semibold"/>
-          <w:color w:val="333333"/>
-          <w:sz w:val="18"/>
-          <w:szCs w:val="18"/>
-        </w:rPr>
-        <w:t xml:space="preserve">São </w:t>
-      </w:r>
-      <w:r>
-        <w:rPr>
-          <w:rFonts w:ascii="Segoe UI Semibold" w:hAnsi="Segoe UI Semibold"/>
-          <w:color w:val="333333"/>
-          <w:sz w:val="18"/>
-          <w:szCs w:val="18"/>
-        </w:rPr>
-        <w:t xml:space="preserve">Funções </w:t>
-      </w:r>
-      <w:r>
-        <w:rPr>
-          <w:rFonts w:ascii="Segoe UI Semibold" w:hAnsi="Segoe UI Semibold"/>
-          <w:color w:val="333333"/>
-          <w:sz w:val="18"/>
-          <w:szCs w:val="18"/>
-        </w:rPr>
-        <w:t>que não possuem um nome explícito.</w:t>
+        <w:t>Responda: São Funções que não possuem um nome explícito.</w:t>
       </w:r>
     </w:p>
     <w:p>
@@ -9039,55 +9019,7 @@
           <w:szCs w:val="18"/>
           <w:u w:val="none"/>
         </w:rPr>
-        <w:t xml:space="preserve"> </w:t>
-      </w:r>
-      <w:r>
-        <w:rPr>
-          <w:rFonts w:ascii="Segoe UI Semibold" w:hAnsi="Segoe UI Semibold"/>
-          <w:b w:val="false"/>
-          <w:bCs w:val="false"/>
-          <w:color w:val="333333"/>
-          <w:sz w:val="18"/>
-          <w:szCs w:val="18"/>
-          <w:u w:val="none"/>
-        </w:rPr>
-        <w:t>C</w:t>
-      </w:r>
-      <w:r>
-        <w:rPr>
-          <w:rFonts w:ascii="Segoe UI Semibold" w:hAnsi="Segoe UI Semibold"/>
-          <w:b w:val="false"/>
-          <w:bCs w:val="false"/>
-          <w:color w:val="333333"/>
-          <w:sz w:val="18"/>
-          <w:szCs w:val="18"/>
-          <w:u w:val="none"/>
-        </w:rPr>
-        <w:t>allback</w:t>
-      </w:r>
-      <w:r>
-        <w:rPr>
-          <w:rFonts w:ascii="Segoe UI Semibold" w:hAnsi="Segoe UI Semibold"/>
-          <w:b w:val="false"/>
-          <w:bCs w:val="false"/>
-          <w:color w:val="333333"/>
-          <w:sz w:val="18"/>
-          <w:szCs w:val="18"/>
-          <w:u w:val="none"/>
-        </w:rPr>
-        <w:t>s</w:t>
-      </w:r>
-      <w:r>
-        <w:rPr>
-          <w:rFonts w:ascii="Segoe UI Semibold" w:hAnsi="Segoe UI Semibold"/>
-          <w:b w:val="false"/>
-          <w:bCs w:val="false"/>
-          <w:color w:val="333333"/>
-          <w:sz w:val="18"/>
-          <w:szCs w:val="18"/>
-          <w:u w:val="none"/>
-        </w:rPr>
-        <w:t xml:space="preserve"> são funções comuns utilizadas como parâmetro de outras funções</w:t>
+        <w:t xml:space="preserve"> Callbacks são funções comuns utilizadas como parâmetro de outras funções</w:t>
       </w:r>
     </w:p>
     <w:p>
@@ -9155,16 +9087,7 @@
           <w:sz w:val="18"/>
           <w:szCs w:val="18"/>
         </w:rPr>
-        <w:t xml:space="preserve">Responda: </w:t>
-      </w:r>
-      <w:r>
-        <w:rPr>
-          <w:rFonts w:ascii="Segoe UI Semibold" w:hAnsi="Segoe UI Semibold"/>
-          <w:color w:val="333333"/>
-          <w:sz w:val="18"/>
-          <w:szCs w:val="18"/>
-        </w:rPr>
-        <w:t>utilizar códigos criados em outros novos locais, em vez de recriar tudo do zero.</w:t>
+        <w:t>Responda: utilizar códigos criados em outros novos locais, em vez de recriar tudo do zero.</w:t>
       </w:r>
     </w:p>
     <w:p>
@@ -9300,16 +9223,7 @@
           <w:sz w:val="18"/>
           <w:szCs w:val="18"/>
         </w:rPr>
-        <w:t>Responda:</w:t>
-      </w:r>
-      <w:r>
-        <w:rPr>
-          <w:rFonts w:ascii="Segoe UI Semibold" w:hAnsi="Segoe UI Semibold"/>
-          <w:color w:val="333333"/>
-          <w:sz w:val="18"/>
-          <w:szCs w:val="18"/>
-        </w:rPr>
-        <w:t xml:space="preserve"> Devido sua sintaxe compacta são muito utilizadas como callbacks e funções pequenas. </w:t>
+        <w:t xml:space="preserve">Responda: Devido sua sintaxe compacta são muito utilizadas como callbacks e funções pequenas. </w:t>
       </w:r>
     </w:p>
     <w:p>
@@ -9958,7 +9872,7 @@
   </w:style>
   <w:style w:type="paragraph" w:styleId="Heading1">
     <w:name w:val="heading 1"/>
-    <w:basedOn w:val="Ttulouser"/>
+    <w:basedOn w:val="Ttulo"/>
     <w:next w:val="BodyText"/>
     <w:qFormat/>
     <w:pPr>
@@ -9975,7 +9889,7 @@
   </w:style>
   <w:style w:type="paragraph" w:styleId="Heading2">
     <w:name w:val="heading 2"/>
-    <w:basedOn w:val="Ttulouser"/>
+    <w:basedOn w:val="Ttulo"/>
     <w:next w:val="BodyText"/>
     <w:qFormat/>
     <w:pPr>
@@ -9992,7 +9906,7 @@
   </w:style>
   <w:style w:type="paragraph" w:styleId="Heading3">
     <w:name w:val="heading 3"/>
-    <w:basedOn w:val="Ttulouser"/>
+    <w:basedOn w:val="Ttulo"/>
     <w:next w:val="BodyText"/>
     <w:qFormat/>
     <w:pPr>
@@ -10007,8 +9921,8 @@
       <w:szCs w:val="28"/>
     </w:rPr>
   </w:style>
-  <w:style w:type="character" w:styleId="Marcadoresuser">
-    <w:name w:val="Marcadores (user)"/>
+  <w:style w:type="character" w:styleId="Marcadores">
+    <w:name w:val="Marcadores"/>
     <w:qFormat/>
     <w:rPr>
       <w:rFonts w:ascii="OpenSymbol" w:hAnsi="OpenSymbol" w:eastAsia="OpenSymbol" w:cs="OpenSymbol"/>
@@ -10022,20 +9936,20 @@
       <w:bCs/>
     </w:rPr>
   </w:style>
-  <w:style w:type="character" w:styleId="Cdigo-fonteuser">
-    <w:name w:val="Código-fonte (user)"/>
+  <w:style w:type="character" w:styleId="Cdigo-fonte">
+    <w:name w:val="Código-fonte"/>
     <w:qFormat/>
     <w:rPr>
       <w:rFonts w:ascii="Liberation Mono" w:hAnsi="Liberation Mono" w:eastAsia="NSimSun" w:cs="Liberation Mono"/>
     </w:rPr>
   </w:style>
-  <w:style w:type="character" w:styleId="Smbolosdenumeraouser">
-    <w:name w:val="Símbolos de numeração (user)"/>
+  <w:style w:type="character" w:styleId="Smbolosdenumerao">
+    <w:name w:val="Símbolos de numeração"/>
     <w:qFormat/>
     <w:rPr/>
   </w:style>
-  <w:style w:type="character" w:styleId="Marcadores">
-    <w:name w:val="Marcadores"/>
+  <w:style w:type="character" w:styleId="Marcadoresuser">
+    <w:name w:val="Marcadores (user)"/>
     <w:qFormat/>
     <w:rPr>
       <w:rFonts w:ascii="OpenSymbol" w:hAnsi="OpenSymbol" w:eastAsia="OpenSymbol" w:cs="OpenSymbol"/>
@@ -10125,8 +10039,8 @@
       <w:rFonts w:ascii="Arial MT" w:hAnsi="Arial MT" w:cs="Arial"/>
     </w:rPr>
   </w:style>
-  <w:style w:type="paragraph" w:styleId="Linhahorizontaluser">
-    <w:name w:val="Linha horizontal (user)"/>
+  <w:style w:type="paragraph" w:styleId="Linhahorizontal">
+    <w:name w:val="Linha horizontal"/>
     <w:basedOn w:val="Normal"/>
     <w:next w:val="BodyText"/>
     <w:qFormat/>
@@ -10142,8 +10056,8 @@
       <w:szCs w:val="12"/>
     </w:rPr>
   </w:style>
-  <w:style w:type="paragraph" w:styleId="Textoprformatadouser">
-    <w:name w:val="Texto préformatado (user)"/>
+  <w:style w:type="paragraph" w:styleId="Textoprformatado">
+    <w:name w:val="Texto préformatado"/>
     <w:basedOn w:val="Normal"/>
     <w:qFormat/>
     <w:pPr>
@@ -10155,8 +10069,8 @@
       <w:szCs w:val="20"/>
     </w:rPr>
   </w:style>
-  <w:style w:type="paragraph" w:styleId="Blocodecitao">
-    <w:name w:val="Bloco de citação"/>
+  <w:style w:type="paragraph" w:styleId="Blocodecitaouser">
+    <w:name w:val="Bloco de citação (user)"/>
     <w:basedOn w:val="Normal"/>
     <w:qFormat/>
     <w:pPr>

</xml_diff>